<commit_message>
Fixed some bugs and shortened the holistic pipeline
Now the results make a bit more sense.
</commit_message>
<xml_diff>
--- a/Rubric_original.docx
+++ b/Rubric_original.docx
@@ -41,7 +41,32 @@
           <w:lang w:eastAsia="de-DE"/>
           <w14:ligatures w14:val="none"/>
         </w:rPr>
-        <w:t xml:space="preserve">In the table below, you can find the criteria that the different sections of the PT:PR final product will be assessed by. Please note that your final grade is NOT a direct weighted average of these elements. Your </w:t>
+        <w:t xml:space="preserve">Use the table below to grade the paper. </w:t>
+      </w:r>
+      <w:r>
+        <w:rPr>
+          <w:rFonts w:ascii="Times New Roman" w:eastAsia="Times New Roman" w:hAnsi="Times New Roman" w:cs="Times New Roman"/>
+          <w:u w:val="single"/>
+          <w:lang w:eastAsia="de-DE"/>
+          <w14:ligatures w14:val="none"/>
+        </w:rPr>
+        <w:t>Do not</w:t>
+      </w:r>
+      <w:r>
+        <w:rPr>
+          <w:rFonts w:ascii="Times New Roman" w:eastAsia="Times New Roman" w:hAnsi="Times New Roman" w:cs="Times New Roman"/>
+          <w:lang w:eastAsia="de-DE"/>
+          <w14:ligatures w14:val="none"/>
+        </w:rPr>
+        <w:t xml:space="preserve"> provide a final grade yourself. Grade each component separately. For the “Results” section, refer to the sample results provided as “Sample_results.pdf”. That reflects how the student should write their results sections. For the rest of the sections, refer to the “Writing_guide.pdf” and “Calibration_summary” as general guides as to what each section should contain</w:t>
+      </w:r>
+      <w:r>
+        <w:rPr>
+          <w:rFonts w:ascii="Times New Roman" w:eastAsia="Times New Roman" w:hAnsi="Times New Roman" w:cs="Times New Roman"/>
+          <w:lang w:eastAsia="de-DE"/>
+          <w14:ligatures w14:val="none"/>
+        </w:rPr>
+        <w:t>. However, your section grades should be primarily based on the rubrics provided here.</w:t>
       </w:r>
       <w:r>
         <w:rPr>
@@ -50,76 +75,7 @@
           <w:lang w:eastAsia="de-DE"/>
           <w14:ligatures w14:val="none"/>
         </w:rPr>
-        <w:t>tutor</w:t>
-      </w:r>
-      <w:r>
-        <w:rPr>
-          <w:rFonts w:ascii="Times New Roman" w:eastAsia="Times New Roman" w:hAnsi="Times New Roman" w:cs="Times New Roman"/>
-          <w:kern w:val="0"/>
-          <w:lang w:eastAsia="de-DE"/>
-          <w14:ligatures w14:val="none"/>
-        </w:rPr>
-        <w:t xml:space="preserve">s will use these columns as guidelines to judge the quality of the different </w:t>
-      </w:r>
-      <w:proofErr w:type="gramStart"/>
-      <w:r>
-        <w:rPr>
-          <w:rFonts w:ascii="Times New Roman" w:eastAsia="Times New Roman" w:hAnsi="Times New Roman" w:cs="Times New Roman"/>
-          <w:kern w:val="0"/>
-          <w:lang w:eastAsia="de-DE"/>
-          <w14:ligatures w14:val="none"/>
-        </w:rPr>
-        <w:t>section</w:t>
-      </w:r>
-      <w:proofErr w:type="gramEnd"/>
-      <w:r>
-        <w:rPr>
-          <w:rFonts w:ascii="Times New Roman" w:eastAsia="Times New Roman" w:hAnsi="Times New Roman" w:cs="Times New Roman"/>
-          <w:kern w:val="0"/>
-          <w:lang w:eastAsia="de-DE"/>
-          <w14:ligatures w14:val="none"/>
-        </w:rPr>
-        <w:t xml:space="preserve"> of your paper. The final grade will </w:t>
-      </w:r>
-      <w:proofErr w:type="gramStart"/>
-      <w:r>
-        <w:rPr>
-          <w:rFonts w:ascii="Times New Roman" w:eastAsia="Times New Roman" w:hAnsi="Times New Roman" w:cs="Times New Roman"/>
-          <w:kern w:val="0"/>
-          <w:lang w:eastAsia="de-DE"/>
-          <w14:ligatures w14:val="none"/>
-        </w:rPr>
-        <w:t>be a reflection of</w:t>
-      </w:r>
-      <w:proofErr w:type="gramEnd"/>
-      <w:r>
-        <w:rPr>
-          <w:rFonts w:ascii="Times New Roman" w:eastAsia="Times New Roman" w:hAnsi="Times New Roman" w:cs="Times New Roman"/>
-          <w:kern w:val="0"/>
-          <w:lang w:eastAsia="de-DE"/>
-          <w14:ligatures w14:val="none"/>
-        </w:rPr>
-        <w:t xml:space="preserve"> your </w:t>
-      </w:r>
-      <w:proofErr w:type="gramStart"/>
-      <w:r>
-        <w:rPr>
-          <w:rFonts w:ascii="Times New Roman" w:eastAsia="Times New Roman" w:hAnsi="Times New Roman" w:cs="Times New Roman"/>
-          <w:kern w:val="0"/>
-          <w:lang w:eastAsia="de-DE"/>
-          <w14:ligatures w14:val="none"/>
-        </w:rPr>
-        <w:t>product as a whole, with</w:t>
-      </w:r>
-      <w:proofErr w:type="gramEnd"/>
-      <w:r>
-        <w:rPr>
-          <w:rFonts w:ascii="Times New Roman" w:eastAsia="Times New Roman" w:hAnsi="Times New Roman" w:cs="Times New Roman"/>
-          <w:kern w:val="0"/>
-          <w:lang w:eastAsia="de-DE"/>
-          <w14:ligatures w14:val="none"/>
-        </w:rPr>
-        <w:t xml:space="preserve"> most weight placed on the scientific reasoning and argumentation (mostly present in the introduction and discussion). </w:t>
+        <w:t xml:space="preserve"> </w:t>
       </w:r>
     </w:p>
     <w:tbl>
@@ -1983,7 +1939,7 @@
                 <w:lang w:eastAsia="de-DE"/>
                 <w14:ligatures w14:val="none"/>
               </w:rPr>
-              <w:t>Scientific Reasoning and Argumentati</w:t>
+              <w:t xml:space="preserve">Scientific Reasoning and </w:t>
             </w:r>
             <w:r>
               <w:rPr>
@@ -1995,7 +1951,7 @@
                 <w14:ligatures w14:val="none"/>
               </w:rPr>
               <w:lastRenderedPageBreak/>
-              <w:t>on</w:t>
+              <w:t>Argumentation</w:t>
             </w:r>
           </w:p>
           <w:p>
@@ -2197,7 +2153,7 @@
                 <w:lang w:eastAsia="de-DE"/>
                 <w14:ligatures w14:val="none"/>
               </w:rPr>
-              <w:t xml:space="preserve">mostly correct, nearly </w:t>
+              <w:t xml:space="preserve">mostly </w:t>
             </w:r>
             <w:r>
               <w:rPr>
@@ -2209,7 +2165,7 @@
                 <w14:ligatures w14:val="none"/>
               </w:rPr>
               <w:lastRenderedPageBreak/>
-              <w:t xml:space="preserve">complete, somewhat coherent </w:t>
+              <w:t xml:space="preserve">correct, nearly complete, somewhat coherent </w:t>
             </w:r>
             <w:r>
               <w:rPr>
@@ -2303,8 +2259,19 @@
                 <w:lang w:eastAsia="de-DE"/>
                 <w14:ligatures w14:val="none"/>
               </w:rPr>
+              <w:t xml:space="preserve">correct, complete, mostly </w:t>
+            </w:r>
+            <w:r>
+              <w:rPr>
+                <w:rFonts w:ascii="Times New Roman" w:eastAsia="Times New Roman" w:hAnsi="Times New Roman" w:cs="Times New Roman"/>
+                <w:b/>
+                <w:bCs/>
+                <w:kern w:val="0"/>
+                <w:lang w:eastAsia="de-DE"/>
+                <w14:ligatures w14:val="none"/>
+              </w:rPr>
               <w:lastRenderedPageBreak/>
-              <w:t xml:space="preserve">correct, complete, mostly coherent </w:t>
+              <w:t xml:space="preserve">coherent </w:t>
             </w:r>
             <w:r>
               <w:rPr>
@@ -3492,6 +3459,7 @@
                 <w:lang w:eastAsia="de-DE"/>
                 <w14:ligatures w14:val="none"/>
               </w:rPr>
+              <w:lastRenderedPageBreak/>
               <w:t xml:space="preserve">- </w:t>
             </w:r>
             <w:r>
@@ -3532,17 +3500,7 @@
                 <w:lang w:eastAsia="de-DE"/>
                 <w14:ligatures w14:val="none"/>
               </w:rPr>
-              <w:t xml:space="preserve"> in </w:t>
-            </w:r>
-            <w:r>
-              <w:rPr>
-                <w:rFonts w:ascii="Times New Roman" w:eastAsia="Times New Roman" w:hAnsi="Times New Roman" w:cs="Times New Roman"/>
-                <w:kern w:val="0"/>
-                <w:lang w:eastAsia="de-DE"/>
-                <w14:ligatures w14:val="none"/>
-              </w:rPr>
-              <w:lastRenderedPageBreak/>
-              <w:t>grammar and/or spelling</w:t>
+              <w:t xml:space="preserve"> in grammar and/or spelling</w:t>
             </w:r>
           </w:p>
           <w:p>
@@ -4018,7 +3976,7 @@
                 <w:lang w:eastAsia="de-DE"/>
                 <w14:ligatures w14:val="none"/>
               </w:rPr>
-              <w:t xml:space="preserve"> errors in APA style referencing or </w:t>
+              <w:t xml:space="preserve"> errors in APA style </w:t>
             </w:r>
             <w:r>
               <w:rPr>
@@ -4028,7 +3986,7 @@
                 <w14:ligatures w14:val="none"/>
               </w:rPr>
               <w:lastRenderedPageBreak/>
-              <w:t>layout</w:t>
+              <w:t>referencing or layout</w:t>
             </w:r>
           </w:p>
           <w:p>
@@ -4335,7 +4293,7 @@
                 <w:lang w:eastAsia="de-DE"/>
                 <w14:ligatures w14:val="none"/>
               </w:rPr>
-              <w:t xml:space="preserve">errors in </w:t>
+              <w:t xml:space="preserve">errors in APA style </w:t>
             </w:r>
             <w:r>
               <w:rPr>
@@ -4345,7 +4303,7 @@
                 <w14:ligatures w14:val="none"/>
               </w:rPr>
               <w:lastRenderedPageBreak/>
-              <w:t>APA style referencing or layout</w:t>
+              <w:t>referencing or layout</w:t>
             </w:r>
           </w:p>
           <w:p>
@@ -4663,7 +4621,7 @@
                 <w:lang w:eastAsia="de-DE"/>
                 <w14:ligatures w14:val="none"/>
               </w:rPr>
-              <w:t xml:space="preserve">errors in grammar and/or </w:t>
+              <w:t xml:space="preserve">errors in </w:t>
             </w:r>
             <w:r>
               <w:rPr>
@@ -4673,7 +4631,7 @@
                 <w14:ligatures w14:val="none"/>
               </w:rPr>
               <w:lastRenderedPageBreak/>
-              <w:t>spelling</w:t>
+              <w:t>grammar and/or spelling</w:t>
             </w:r>
           </w:p>
           <w:p>
@@ -5031,7 +4989,7 @@
                 <w:lang w:eastAsia="de-DE"/>
                 <w14:ligatures w14:val="none"/>
               </w:rPr>
-              <w:t xml:space="preserve"> sentences are clearly structured (e.g. </w:t>
+              <w:t xml:space="preserve"> sentences are clearly </w:t>
             </w:r>
             <w:r>
               <w:rPr>
@@ -5041,7 +4999,7 @@
                 <w14:ligatures w14:val="none"/>
               </w:rPr>
               <w:lastRenderedPageBreak/>
-              <w:t>single focus and topical sentences)</w:t>
+              <w:t>structured (e.g. single focus and topical sentences)</w:t>
             </w:r>
           </w:p>
           <w:p>

</xml_diff>